<commit_message>
Báo cáo thực tập tuần 4
</commit_message>
<xml_diff>
--- a/Báo cáo thực tập.docx
+++ b/Báo cáo thực tập.docx
@@ -1009,10 +1009,17 @@
     </w:p>
     <w:p>
       <w:pPr>
-        <w:rPr>
-          <w:rFonts w:ascii="Times New Roman" w:cs="Times New Roman" w:eastAsia="Times New Roman" w:hAnsi="Times New Roman"/>
-        </w:rPr>
-      </w:pPr>
+        <w:jc w:val="center"/>
+        <w:rPr>
+          <w:b w:val="1"/>
+          <w:bCs w:val="1"/>
+          <w:sz w:val="32"/>
+          <w:szCs w:val="32"/>
+        </w:rPr>
+      </w:pPr>
+      <w:r>
+        <w:br w:type="page"/>
+      </w:r>
       <w:r>
         <w:rPr>
           <w:rtl w:val="0"/>
@@ -6291,16 +6298,65 @@
             <w:pPr>
               <w:spacing w:line="432" w:lineRule="auto"/>
               <w:jc w:val="both"/>
-              <w:rPr>
-                <w:rFonts w:ascii="Times New Roman" w:cs="Times New Roman" w:eastAsia="Times New Roman" w:hAnsi="Times New Roman"/>
-                <w:sz w:val="26"/>
-                <w:szCs w:val="26"/>
-              </w:rPr>
-            </w:pPr>
-            <w:r>
-              <w:rPr>
-                <w:rtl w:val="0"/>
-              </w:rPr>
+              <w:rPr/>
+            </w:pPr>
+            <w:r>
+              <w:rPr>
+                <w:rtl w:val="0"/>
+              </w:rPr>
+              <w:t xml:space="preserve">- Hỗ trợ kiểm tra và đối chiếu thông tin học sinh lớp 6 theo hồ sơ được cung cấp.</w:t>
+            </w:r>
+          </w:p>
+          <w:p>
+            <w:pPr>
+              <w:spacing w:line="432" w:lineRule="auto"/>
+              <w:jc w:val="both"/>
+              <w:rPr/>
+            </w:pPr>
+            <w:r>
+              <w:rPr>
+                <w:rtl w:val="0"/>
+              </w:rPr>
+              <w:t xml:space="preserve">- Hỗ trợ nhập liệu và cập nhật thông tin học sinh theo hướng dẫn của cán bộ phụ trách.</w:t>
+            </w:r>
+          </w:p>
+          <w:p>
+            <w:pPr>
+              <w:spacing w:line="432" w:lineRule="auto"/>
+              <w:jc w:val="both"/>
+              <w:rPr/>
+            </w:pPr>
+            <w:r>
+              <w:rPr>
+                <w:rtl w:val="0"/>
+              </w:rPr>
+              <w:t xml:space="preserve">- Kiểm tra lại thông tin sau khi nhập nhằm đảm bảo dữ liệu đầy đủ và chính xác.</w:t>
+            </w:r>
+          </w:p>
+          <w:p>
+            <w:pPr>
+              <w:spacing w:line="432" w:lineRule="auto"/>
+              <w:jc w:val="both"/>
+              <w:rPr/>
+            </w:pPr>
+            <w:r>
+              <w:rPr>
+                <w:rtl w:val="0"/>
+              </w:rPr>
+              <w:t xml:space="preserve">- Hỗ trợ in ấn, sắp xếp và chuẩn bị các biểu mẫu, danh sách phục vụ công tác tuyển sinh đầu năm học.</w:t>
+            </w:r>
+          </w:p>
+          <w:p>
+            <w:pPr>
+              <w:spacing w:line="432" w:lineRule="auto"/>
+              <w:jc w:val="both"/>
+              <w:rPr/>
+            </w:pPr>
+            <w:r>
+              <w:rPr>
+                <w:rtl w:val="0"/>
+              </w:rPr>
+              <w:t xml:space="preserve">- Thực hiện một số công việc hành chính liên quan theo sự phân công.</w:t>
             </w:r>
           </w:p>
         </w:tc>
@@ -6324,16 +6380,52 @@
             <w:pPr>
               <w:spacing w:line="432" w:lineRule="auto"/>
               <w:jc w:val="both"/>
-              <w:rPr>
-                <w:rFonts w:ascii="Times New Roman" w:cs="Times New Roman" w:eastAsia="Times New Roman" w:hAnsi="Times New Roman"/>
-                <w:sz w:val="26"/>
-                <w:szCs w:val="26"/>
-              </w:rPr>
-            </w:pPr>
-            <w:r>
-              <w:rPr>
-                <w:rtl w:val="0"/>
-              </w:rPr>
+              <w:rPr/>
+            </w:pPr>
+            <w:r>
+              <w:rPr>
+                <w:rtl w:val="0"/>
+              </w:rPr>
+              <w:t xml:space="preserve">- Hoàn thành các công việc kiểm tra, đối chiếu và nhập liệu được phân công.</w:t>
+            </w:r>
+          </w:p>
+          <w:p>
+            <w:pPr>
+              <w:spacing w:line="432" w:lineRule="auto"/>
+              <w:jc w:val="both"/>
+              <w:rPr/>
+            </w:pPr>
+            <w:r>
+              <w:rPr>
+                <w:rtl w:val="0"/>
+              </w:rPr>
+              <w:t xml:space="preserve">- Biết cách đối chiếu thông tin giữa hồ sơ và dữ liệu đã nhập.</w:t>
+            </w:r>
+          </w:p>
+          <w:p>
+            <w:pPr>
+              <w:spacing w:line="432" w:lineRule="auto"/>
+              <w:jc w:val="both"/>
+              <w:rPr/>
+            </w:pPr>
+            <w:r>
+              <w:rPr>
+                <w:rtl w:val="0"/>
+              </w:rPr>
+              <w:t xml:space="preserve">- Cải thiện kỹ năng nhập liệu và kiểm tra tính chính xác của thông tin.</w:t>
+            </w:r>
+          </w:p>
+          <w:p>
+            <w:pPr>
+              <w:spacing w:line="432" w:lineRule="auto"/>
+              <w:jc w:val="both"/>
+              <w:rPr/>
+            </w:pPr>
+            <w:r>
+              <w:rPr>
+                <w:rtl w:val="0"/>
+              </w:rPr>
+              <w:t xml:space="preserve">- Hỗ trợ chuẩn bị và hoàn thiện các biểu mẫu, tài liệu phục vụ công tác tuyển sinh.</w:t>
             </w:r>
           </w:p>
         </w:tc>

</xml_diff>

<commit_message>
Báo cáo thực tập tuần 8
</commit_message>
<xml_diff>
--- a/Báo cáo thực tập.docx
+++ b/Báo cáo thực tập.docx
@@ -5007,13 +5007,28 @@
       <w:r>
         <w:fldChar w:fldCharType="separate"/>
       </w:r>
-      <w:hyperlink w:anchor="_Toc238895349" w:history="1">
+      <w:hyperlink w:anchor="_Toc239466269" w:history="1">
         <w:r>
           <w:rPr>
             <w:rStyle w:val="Hyperlink"/>
             <w:noProof/>
           </w:rPr>
-          <w:t>Hình 1. Quy trình xử lý dữ liệu</w:t>
+          <w:t>Hình 1</w:t>
+        </w:r>
+        <w:r>
+          <w:rPr>
+            <w:rStyle w:val="Hyperlink"/>
+            <w:noProof/>
+            <w:lang w:val="en-US"/>
+          </w:rPr>
+          <w:t>:</w:t>
+        </w:r>
+        <w:r>
+          <w:rPr>
+            <w:rStyle w:val="Hyperlink"/>
+            <w:noProof/>
+          </w:rPr>
+          <w:t xml:space="preserve"> Quy trình xử lý dữ liệu</w:t>
         </w:r>
         <w:r>
           <w:rPr>
@@ -5034,7 +5049,7 @@
             <w:noProof/>
             <w:webHidden/>
           </w:rPr>
-          <w:instrText xml:space="preserve"> PAGEREF _Toc238895349 \h </w:instrText>
+          <w:instrText xml:space="preserve"> PAGEREF _Toc239466269 \h </w:instrText>
         </w:r>
         <w:r>
           <w:rPr>
@@ -5081,7 +5096,7 @@
           <w14:ligatures w14:val="standardContextual"/>
         </w:rPr>
       </w:pPr>
-      <w:hyperlink w:anchor="_Toc238895350" w:history="1">
+      <w:hyperlink w:anchor="_Toc239466270" w:history="1">
         <w:r>
           <w:rPr>
             <w:rStyle w:val="Hyperlink"/>
@@ -5108,7 +5123,7 @@
             <w:noProof/>
             <w:webHidden/>
           </w:rPr>
-          <w:instrText xml:space="preserve"> PAGEREF _Toc238895350 \h </w:instrText>
+          <w:instrText xml:space="preserve"> PAGEREF _Toc239466270 \h </w:instrText>
         </w:r>
         <w:r>
           <w:rPr>
@@ -5155,7 +5170,7 @@
           <w14:ligatures w14:val="standardContextual"/>
         </w:rPr>
       </w:pPr>
-      <w:hyperlink w:anchor="_Toc238895351" w:history="1">
+      <w:hyperlink w:anchor="_Toc239466271" w:history="1">
         <w:r>
           <w:rPr>
             <w:rStyle w:val="Hyperlink"/>
@@ -5182,7 +5197,7 @@
             <w:noProof/>
             <w:webHidden/>
           </w:rPr>
-          <w:instrText xml:space="preserve"> PAGEREF _Toc238895351 \h </w:instrText>
+          <w:instrText xml:space="preserve"> PAGEREF _Toc239466271 \h </w:instrText>
         </w:r>
         <w:r>
           <w:rPr>
@@ -5229,7 +5244,7 @@
           <w14:ligatures w14:val="standardContextual"/>
         </w:rPr>
       </w:pPr>
-      <w:hyperlink w:anchor="_Toc238895352" w:history="1">
+      <w:hyperlink w:anchor="_Toc239466272" w:history="1">
         <w:r>
           <w:rPr>
             <w:rStyle w:val="Hyperlink"/>
@@ -5256,7 +5271,7 @@
             <w:noProof/>
             <w:webHidden/>
           </w:rPr>
-          <w:instrText xml:space="preserve"> PAGEREF _Toc238895352 \h </w:instrText>
+          <w:instrText xml:space="preserve"> PAGEREF _Toc239466272 \h </w:instrText>
         </w:r>
         <w:r>
           <w:rPr>
@@ -5303,7 +5318,7 @@
           <w14:ligatures w14:val="standardContextual"/>
         </w:rPr>
       </w:pPr>
-      <w:hyperlink w:anchor="_Toc238895353" w:history="1">
+      <w:hyperlink w:anchor="_Toc239466273" w:history="1">
         <w:r>
           <w:rPr>
             <w:rStyle w:val="Hyperlink"/>
@@ -5330,7 +5345,7 @@
             <w:noProof/>
             <w:webHidden/>
           </w:rPr>
-          <w:instrText xml:space="preserve"> PAGEREF _Toc238895353 \h </w:instrText>
+          <w:instrText xml:space="preserve"> PAGEREF _Toc239466273 \h </w:instrText>
         </w:r>
         <w:r>
           <w:rPr>
@@ -5362,42 +5377,10 @@
       </w:hyperlink>
     </w:p>
     <w:p>
-      <w:r>
-        <w:fldChar w:fldCharType="end"/>
-      </w:r>
-    </w:p>
-    <w:p>
-      <w:pPr>
-        <w:rPr>
-          <w:b/>
-          <w:bCs/>
-          <w:sz w:val="40"/>
-          <w:szCs w:val="40"/>
-        </w:rPr>
-      </w:pPr>
-      <w:r>
-        <w:br w:type="page"/>
-      </w:r>
-    </w:p>
-    <w:p>
-      <w:pPr>
-        <w:pStyle w:val="Title"/>
-        <w:spacing w:line="360" w:lineRule="auto"/>
-        <w:jc w:val="center"/>
-        <w:rPr>
-          <w:lang w:val="en-US"/>
-        </w:rPr>
-      </w:pPr>
-      <w:r>
-        <w:lastRenderedPageBreak/>
-        <w:t>DANH MỤC BẢNG</w:t>
-      </w:r>
-    </w:p>
-    <w:p>
       <w:pPr>
         <w:pStyle w:val="TableofFigures"/>
         <w:tabs>
-          <w:tab w:val="right" w:leader="dot" w:pos="9064"/>
+          <w:tab w:val="right" w:pos="9064"/>
         </w:tabs>
         <w:rPr>
           <w:rFonts w:asciiTheme="minorHAnsi" w:eastAsiaTheme="minorEastAsia" w:hAnsiTheme="minorHAnsi" w:cstheme="minorBidi"/>
@@ -5409,34 +5392,13 @@
           <w14:ligatures w14:val="standardContextual"/>
         </w:rPr>
       </w:pPr>
-      <w:r>
-        <w:rPr>
-          <w:b/>
-          <w:bCs/>
-        </w:rPr>
-        <w:fldChar w:fldCharType="begin"/>
-      </w:r>
-      <w:r>
-        <w:rPr>
-          <w:b/>
-          <w:bCs/>
-        </w:rPr>
-        <w:instrText xml:space="preserve"> TOC \h \z \c "Bảng" </w:instrText>
-      </w:r>
-      <w:r>
-        <w:rPr>
-          <w:b/>
-          <w:bCs/>
-        </w:rPr>
-        <w:fldChar w:fldCharType="separate"/>
-      </w:r>
-      <w:hyperlink w:anchor="_Toc238895339" w:history="1">
+      <w:hyperlink w:anchor="_Toc239466274" w:history="1">
         <w:r>
           <w:rPr>
             <w:rStyle w:val="Hyperlink"/>
             <w:noProof/>
           </w:rPr>
-          <w:t>Bảng 1. Lịch làm việc tại nơi thực tập</w:t>
+          <w:t>Hình 6: Dashboard tổng quan phân tích dữ liệu học sinh trên Power BI</w:t>
         </w:r>
         <w:r>
           <w:rPr>
@@ -5457,7 +5419,134 @@
             <w:noProof/>
             <w:webHidden/>
           </w:rPr>
-          <w:instrText xml:space="preserve"> PAGEREF _Toc238895339 \h </w:instrText>
+          <w:instrText xml:space="preserve"> PAGEREF _Toc239466274 \h </w:instrText>
+        </w:r>
+        <w:r>
+          <w:rPr>
+            <w:noProof/>
+            <w:webHidden/>
+          </w:rPr>
+        </w:r>
+        <w:r>
+          <w:rPr>
+            <w:noProof/>
+            <w:webHidden/>
+          </w:rPr>
+          <w:fldChar w:fldCharType="separate"/>
+        </w:r>
+        <w:r>
+          <w:rPr>
+            <w:noProof/>
+            <w:webHidden/>
+          </w:rPr>
+          <w:t>37</w:t>
+        </w:r>
+        <w:r>
+          <w:rPr>
+            <w:noProof/>
+            <w:webHidden/>
+          </w:rPr>
+          <w:fldChar w:fldCharType="end"/>
+        </w:r>
+      </w:hyperlink>
+    </w:p>
+    <w:p>
+      <w:r>
+        <w:fldChar w:fldCharType="end"/>
+      </w:r>
+    </w:p>
+    <w:p>
+      <w:pPr>
+        <w:rPr>
+          <w:b/>
+          <w:bCs/>
+          <w:sz w:val="40"/>
+          <w:szCs w:val="40"/>
+        </w:rPr>
+      </w:pPr>
+      <w:r>
+        <w:br w:type="page"/>
+      </w:r>
+    </w:p>
+    <w:p>
+      <w:pPr>
+        <w:pStyle w:val="Title"/>
+        <w:spacing w:line="360" w:lineRule="auto"/>
+        <w:jc w:val="center"/>
+        <w:rPr>
+          <w:lang w:val="en-US"/>
+        </w:rPr>
+      </w:pPr>
+      <w:r>
+        <w:lastRenderedPageBreak/>
+        <w:t>DANH MỤC BẢNG</w:t>
+      </w:r>
+    </w:p>
+    <w:p>
+      <w:pPr>
+        <w:pStyle w:val="TableofFigures"/>
+        <w:tabs>
+          <w:tab w:val="right" w:leader="dot" w:pos="9064"/>
+        </w:tabs>
+        <w:rPr>
+          <w:rFonts w:asciiTheme="minorHAnsi" w:eastAsiaTheme="minorEastAsia" w:hAnsiTheme="minorHAnsi" w:cstheme="minorBidi"/>
+          <w:noProof/>
+          <w:kern w:val="2"/>
+          <w:sz w:val="24"/>
+          <w:szCs w:val="24"/>
+          <w:lang w:val="en-US"/>
+          <w14:ligatures w14:val="standardContextual"/>
+        </w:rPr>
+      </w:pPr>
+      <w:r>
+        <w:rPr>
+          <w:b/>
+          <w:bCs/>
+        </w:rPr>
+        <w:fldChar w:fldCharType="begin"/>
+      </w:r>
+      <w:r>
+        <w:rPr>
+          <w:b/>
+          <w:bCs/>
+        </w:rPr>
+        <w:instrText xml:space="preserve"> TOC \h \z \c "Bảng" </w:instrText>
+      </w:r>
+      <w:r>
+        <w:rPr>
+          <w:b/>
+          <w:bCs/>
+        </w:rPr>
+        <w:fldChar w:fldCharType="separate"/>
+      </w:r>
+      <w:hyperlink w:anchor="_Toc239466275" w:history="1">
+        <w:r>
+          <w:rPr>
+            <w:rStyle w:val="Hyperlink"/>
+            <w:noProof/>
+          </w:rPr>
+          <w:t>Bảng 1: Lịch làm việc tại nơi thực tập</w:t>
+        </w:r>
+        <w:r>
+          <w:rPr>
+            <w:noProof/>
+            <w:webHidden/>
+          </w:rPr>
+          <w:tab/>
+        </w:r>
+        <w:r>
+          <w:rPr>
+            <w:noProof/>
+            <w:webHidden/>
+          </w:rPr>
+          <w:fldChar w:fldCharType="begin"/>
+        </w:r>
+        <w:r>
+          <w:rPr>
+            <w:noProof/>
+            <w:webHidden/>
+          </w:rPr>
+          <w:instrText xml:space="preserve"> PAGEREF _Toc239466275 \h </w:instrText>
         </w:r>
         <w:r>
           <w:rPr>
@@ -5504,21 +5593,13 @@
           <w14:ligatures w14:val="standardContextual"/>
         </w:rPr>
       </w:pPr>
-      <w:hyperlink w:anchor="_Toc238895340" w:history="1">
+      <w:hyperlink w:anchor="_Toc239466276" w:history="1">
         <w:r>
           <w:rPr>
             <w:rStyle w:val="Hyperlink"/>
             <w:noProof/>
           </w:rPr>
-          <w:t>Bảng 2</w:t>
-        </w:r>
-        <w:r>
-          <w:rPr>
-            <w:rStyle w:val="Hyperlink"/>
-            <w:noProof/>
-            <w:lang w:val="en-US"/>
-          </w:rPr>
-          <w:t>: Thống kê cấu trúc các tập dữ liệu</w:t>
+          <w:t>Bảng 2: Thống kê cấu trúc các tập dữ liệu</w:t>
         </w:r>
         <w:r>
           <w:rPr>
@@ -5539,7 +5620,7 @@
             <w:noProof/>
             <w:webHidden/>
           </w:rPr>
-          <w:instrText xml:space="preserve"> PAGEREF _Toc238895340 \h </w:instrText>
+          <w:instrText xml:space="preserve"> PAGEREF _Toc239466276 \h </w:instrText>
         </w:r>
         <w:r>
           <w:rPr>
@@ -5586,21 +5667,13 @@
           <w14:ligatures w14:val="standardContextual"/>
         </w:rPr>
       </w:pPr>
-      <w:hyperlink w:anchor="_Toc238895341" w:history="1">
+      <w:hyperlink w:anchor="_Toc239466277" w:history="1">
         <w:r>
           <w:rPr>
             <w:rStyle w:val="Hyperlink"/>
             <w:noProof/>
           </w:rPr>
-          <w:t>Bảng 3</w:t>
-        </w:r>
-        <w:r>
-          <w:rPr>
-            <w:rStyle w:val="Hyperlink"/>
-            <w:noProof/>
-            <w:lang w:val="en-US"/>
-          </w:rPr>
-          <w:t>: Kết quả kiểm tra kiểu dữ liệu ban đầu</w:t>
+          <w:t>Bảng 3: Kết quả kiểm tra kiểu dữ liệu ban đầu</w:t>
         </w:r>
         <w:r>
           <w:rPr>
@@ -5621,7 +5694,7 @@
             <w:noProof/>
             <w:webHidden/>
           </w:rPr>
-          <w:instrText xml:space="preserve"> PAGEREF _Toc238895341 \h </w:instrText>
+          <w:instrText xml:space="preserve"> PAGEREF _Toc239466277 \h </w:instrText>
         </w:r>
         <w:r>
           <w:rPr>
@@ -5668,21 +5741,13 @@
           <w14:ligatures w14:val="standardContextual"/>
         </w:rPr>
       </w:pPr>
-      <w:hyperlink w:anchor="_Toc238895342" w:history="1">
+      <w:hyperlink w:anchor="_Toc239466278" w:history="1">
         <w:r>
           <w:rPr>
             <w:rStyle w:val="Hyperlink"/>
             <w:noProof/>
           </w:rPr>
-          <w:t>Bảng 4</w:t>
-        </w:r>
-        <w:r>
-          <w:rPr>
-            <w:rStyle w:val="Hyperlink"/>
-            <w:noProof/>
-            <w:lang w:val="en-US"/>
-          </w:rPr>
-          <w:t>: So sánh kiểu dữ liệu trước và sau khi chuẩn hóa</w:t>
+          <w:t>Bảng 4: So sánh kiểu dữ liệu trước và sau khi chuẩn hóa</w:t>
         </w:r>
         <w:r>
           <w:rPr>
@@ -5703,7 +5768,7 @@
             <w:noProof/>
             <w:webHidden/>
           </w:rPr>
-          <w:instrText xml:space="preserve"> PAGEREF _Toc238895342 \h </w:instrText>
+          <w:instrText xml:space="preserve"> PAGEREF _Toc239466278 \h </w:instrText>
         </w:r>
         <w:r>
           <w:rPr>
@@ -5750,7 +5815,7 @@
           <w14:ligatures w14:val="standardContextual"/>
         </w:rPr>
       </w:pPr>
-      <w:hyperlink w:anchor="_Toc238895343" w:history="1">
+      <w:hyperlink w:anchor="_Toc239466279" w:history="1">
         <w:r>
           <w:rPr>
             <w:rStyle w:val="Hyperlink"/>
@@ -5777,7 +5842,7 @@
             <w:noProof/>
             <w:webHidden/>
           </w:rPr>
-          <w:instrText xml:space="preserve"> PAGEREF _Toc238895343 \h </w:instrText>
+          <w:instrText xml:space="preserve"> PAGEREF _Toc239466279 \h </w:instrText>
         </w:r>
         <w:r>
           <w:rPr>
@@ -5824,7 +5889,7 @@
           <w14:ligatures w14:val="standardContextual"/>
         </w:rPr>
       </w:pPr>
-      <w:hyperlink w:anchor="_Toc238895344" w:history="1">
+      <w:hyperlink w:anchor="_Toc239466280" w:history="1">
         <w:r>
           <w:rPr>
             <w:rStyle w:val="Hyperlink"/>
@@ -5851,7 +5916,7 @@
             <w:noProof/>
             <w:webHidden/>
           </w:rPr>
-          <w:instrText xml:space="preserve"> PAGEREF _Toc238895344 \h </w:instrText>
+          <w:instrText xml:space="preserve"> PAGEREF _Toc239466280 \h </w:instrText>
         </w:r>
         <w:r>
           <w:rPr>
@@ -5898,7 +5963,7 @@
           <w14:ligatures w14:val="standardContextual"/>
         </w:rPr>
       </w:pPr>
-      <w:hyperlink w:anchor="_Toc238895345" w:history="1">
+      <w:hyperlink w:anchor="_Toc239466281" w:history="1">
         <w:r>
           <w:rPr>
             <w:rStyle w:val="Hyperlink"/>
@@ -5925,7 +5990,7 @@
             <w:noProof/>
             <w:webHidden/>
           </w:rPr>
-          <w:instrText xml:space="preserve"> PAGEREF _Toc238895345 \h </w:instrText>
+          <w:instrText xml:space="preserve"> PAGEREF _Toc239466281 \h </w:instrText>
         </w:r>
         <w:r>
           <w:rPr>
@@ -5972,7 +6037,7 @@
           <w14:ligatures w14:val="standardContextual"/>
         </w:rPr>
       </w:pPr>
-      <w:hyperlink w:anchor="_Toc238895346" w:history="1">
+      <w:hyperlink w:anchor="_Toc239466282" w:history="1">
         <w:r>
           <w:rPr>
             <w:rStyle w:val="Hyperlink"/>
@@ -5999,7 +6064,7 @@
             <w:noProof/>
             <w:webHidden/>
           </w:rPr>
-          <w:instrText xml:space="preserve"> PAGEREF _Toc238895346 \h </w:instrText>
+          <w:instrText xml:space="preserve"> PAGEREF _Toc239466282 \h </w:instrText>
         </w:r>
         <w:r>
           <w:rPr>
@@ -6046,7 +6111,7 @@
           <w14:ligatures w14:val="standardContextual"/>
         </w:rPr>
       </w:pPr>
-      <w:hyperlink w:anchor="_Toc238895347" w:history="1">
+      <w:hyperlink w:anchor="_Toc239466283" w:history="1">
         <w:r>
           <w:rPr>
             <w:rStyle w:val="Hyperlink"/>
@@ -6073,7 +6138,7 @@
             <w:noProof/>
             <w:webHidden/>
           </w:rPr>
-          <w:instrText xml:space="preserve"> PAGEREF _Toc238895347 \h </w:instrText>
+          <w:instrText xml:space="preserve"> PAGEREF _Toc239466283 \h </w:instrText>
         </w:r>
         <w:r>
           <w:rPr>
@@ -6120,7 +6185,7 @@
           <w14:ligatures w14:val="standardContextual"/>
         </w:rPr>
       </w:pPr>
-      <w:hyperlink w:anchor="_Toc238895348" w:history="1">
+      <w:hyperlink w:anchor="_Toc239466284" w:history="1">
         <w:r>
           <w:rPr>
             <w:rStyle w:val="Hyperlink"/>
@@ -6147,7 +6212,7 @@
             <w:noProof/>
             <w:webHidden/>
           </w:rPr>
-          <w:instrText xml:space="preserve"> PAGEREF _Toc238895348 \h </w:instrText>
+          <w:instrText xml:space="preserve"> PAGEREF _Toc239466284 \h </w:instrText>
         </w:r>
         <w:r>
           <w:rPr>
@@ -7431,7 +7496,8 @@
       <w:pPr>
         <w:pStyle w:val="Caption"/>
       </w:pPr>
-      <w:bookmarkStart w:id="15" w:name="_Toc238895339"/>
+      <w:bookmarkStart w:id="15" w:name="_Toc239466275"/>
+      <w:bookmarkStart w:id="16" w:name="_Toc238895376"/>
       <w:r>
         <w:t xml:space="preserve">Bảng </w:t>
       </w:r>
@@ -7444,7 +7510,7 @@
         </w:r>
       </w:fldSimple>
       <w:r>
-        <w:t>. Lịch làm việc tại nơi thực tập</w:t>
+        <w:t>: Lịch làm việc tại nơi thực tập</w:t>
       </w:r>
       <w:bookmarkEnd w:id="15"/>
     </w:p>
@@ -7459,7 +7525,6 @@
           <w:lang w:val="en-US"/>
         </w:rPr>
       </w:pPr>
-      <w:bookmarkStart w:id="16" w:name="_Toc238895376"/>
       <w:r>
         <w:rPr>
           <w:lang w:val="en-US"/>
@@ -8181,9 +8246,8 @@
     <w:p>
       <w:pPr>
         <w:pStyle w:val="Caption"/>
-        <w:spacing w:line="360" w:lineRule="auto"/>
-      </w:pPr>
-      <w:bookmarkStart w:id="30" w:name="_Toc238895349"/>
+      </w:pPr>
+      <w:bookmarkStart w:id="30" w:name="_Toc239466269"/>
       <w:r>
         <w:t xml:space="preserve">Hình </w:t>
       </w:r>
@@ -8196,7 +8260,13 @@
         </w:r>
       </w:fldSimple>
       <w:r>
-        <w:t>. Quy trình xử lý dữ liệu</w:t>
+        <w:rPr>
+          <w:lang w:val="en-US"/>
+        </w:rPr>
+        <w:t>:</w:t>
+      </w:r>
+      <w:r>
+        <w:t xml:space="preserve"> Quy trình xử lý dữ liệu</w:t>
       </w:r>
       <w:bookmarkEnd w:id="30"/>
     </w:p>
@@ -10461,7 +10531,7 @@
       <w:pPr>
         <w:pStyle w:val="Caption"/>
       </w:pPr>
-      <w:bookmarkStart w:id="44" w:name="_Toc238895340"/>
+      <w:bookmarkStart w:id="44" w:name="_Toc239466276"/>
       <w:r>
         <w:t xml:space="preserve">Bảng </w:t>
       </w:r>
@@ -10911,7 +10981,7 @@
       <w:pPr>
         <w:pStyle w:val="Caption"/>
       </w:pPr>
-      <w:bookmarkStart w:id="46" w:name="_Toc238895341"/>
+      <w:bookmarkStart w:id="46" w:name="_Toc239466277"/>
       <w:r>
         <w:t xml:space="preserve">Bảng </w:t>
       </w:r>
@@ -11077,7 +11147,7 @@
       <w:pPr>
         <w:pStyle w:val="Caption"/>
       </w:pPr>
-      <w:bookmarkStart w:id="49" w:name="_Toc238895350"/>
+      <w:bookmarkStart w:id="49" w:name="_Toc239466270"/>
       <w:r>
         <w:t xml:space="preserve">Hình </w:t>
       </w:r>
@@ -11210,7 +11280,7 @@
       <w:pPr>
         <w:pStyle w:val="Caption"/>
       </w:pPr>
-      <w:bookmarkStart w:id="52" w:name="_Toc238895351"/>
+      <w:bookmarkStart w:id="52" w:name="_Toc239466271"/>
       <w:r>
         <w:t xml:space="preserve">Hình </w:t>
       </w:r>
@@ -12203,7 +12273,7 @@
       <w:pPr>
         <w:pStyle w:val="Caption"/>
       </w:pPr>
-      <w:bookmarkStart w:id="65" w:name="_Toc238895342"/>
+      <w:bookmarkStart w:id="65" w:name="_Toc239466278"/>
       <w:r>
         <w:t xml:space="preserve">Bảng </w:t>
       </w:r>
@@ -12766,7 +12836,7 @@
       <w:pPr>
         <w:pStyle w:val="Caption"/>
       </w:pPr>
-      <w:bookmarkStart w:id="68" w:name="_Toc238895343"/>
+      <w:bookmarkStart w:id="68" w:name="_Toc239466279"/>
       <w:r>
         <w:t xml:space="preserve">Bảng </w:t>
       </w:r>
@@ -12798,14 +12868,8 @@
           <w:ilvl w:val="0"/>
           <w:numId w:val="40"/>
         </w:numPr>
-        <w:rPr>
-          <w:lang w:val="en-US"/>
-        </w:rPr>
-      </w:pPr>
-      <w:r>
-        <w:rPr>
-          <w:lang w:val="en-US"/>
-        </w:rPr>
+      </w:pPr>
+      <w:r>
         <w:t>Thông tin Khối được bổ sung nhằm phục vụ phân tích sự phân bổ học sinh theo từng khối lớp.</w:t>
       </w:r>
     </w:p>
@@ -12816,14 +12880,8 @@
           <w:ilvl w:val="0"/>
           <w:numId w:val="40"/>
         </w:numPr>
-        <w:rPr>
-          <w:lang w:val="en-US"/>
-        </w:rPr>
-      </w:pPr>
-      <w:r>
-        <w:rPr>
-          <w:lang w:val="en-US"/>
-        </w:rPr>
+      </w:pPr>
+      <w:r>
         <w:t>Trong quá trình xử lý, mã định danh và họ tên được chuẩn hóa trước khi thực hiện đối chiếu với dữ liệu tra cứu khối. Việc này giúp hạn chế ảnh hưởng của sự khác biệt về định dạng dữ liệu giữa các tệp.</w:t>
       </w:r>
     </w:p>
@@ -12834,14 +12892,8 @@
           <w:ilvl w:val="0"/>
           <w:numId w:val="40"/>
         </w:numPr>
-        <w:rPr>
-          <w:lang w:val="en-US"/>
-        </w:rPr>
-      </w:pPr>
-      <w:r>
-        <w:rPr>
-          <w:lang w:val="en-US"/>
-        </w:rPr>
+      </w:pPr>
+      <w:r>
         <w:t>Ngoài trường Khối, dữ liệu còn được bổ sung trường Khối chuẩn và Nguồn Khối để phục vụ kiểm tra tính hợp lý của kết quả đối chiếu.</w:t>
       </w:r>
     </w:p>
@@ -12852,14 +12904,8 @@
           <w:ilvl w:val="0"/>
           <w:numId w:val="40"/>
         </w:numPr>
-        <w:rPr>
-          <w:lang w:val="en-US"/>
-        </w:rPr>
-      </w:pPr>
-      <w:r>
-        <w:rPr>
-          <w:lang w:val="en-US"/>
-        </w:rPr>
+      </w:pPr>
+      <w:r>
         <w:t>Sau khi hoàn thành bước kiểm tra, các trường trung gian như Khối_num, Khối_chuẩn_num và Độ lệch khối được loại bỏ vì chỉ được sử dụng trong quá trình kiểm tra và không cần thiết cho tập dữ liệu phân tích cuối cùng.</w:t>
       </w:r>
     </w:p>
@@ -13177,7 +13223,7 @@
       <w:pPr>
         <w:pStyle w:val="Caption"/>
       </w:pPr>
-      <w:bookmarkStart w:id="72" w:name="_Toc238895352"/>
+      <w:bookmarkStart w:id="72" w:name="_Toc239466272"/>
       <w:r>
         <w:t xml:space="preserve">Hình </w:t>
       </w:r>
@@ -13343,7 +13389,7 @@
       <w:pPr>
         <w:pStyle w:val="Caption"/>
       </w:pPr>
-      <w:bookmarkStart w:id="74" w:name="_Toc238895353"/>
+      <w:bookmarkStart w:id="74" w:name="_Toc239466273"/>
       <w:r>
         <w:t xml:space="preserve">Hình </w:t>
       </w:r>
@@ -13753,7 +13799,7 @@
       <w:pPr>
         <w:pStyle w:val="Caption"/>
       </w:pPr>
-      <w:bookmarkStart w:id="77" w:name="_Toc238895344"/>
+      <w:bookmarkStart w:id="77" w:name="_Toc239466280"/>
       <w:r>
         <w:t xml:space="preserve">Bảng </w:t>
       </w:r>
@@ -14455,7 +14501,7 @@
       <w:pPr>
         <w:pStyle w:val="Caption"/>
       </w:pPr>
-      <w:bookmarkStart w:id="78" w:name="_Toc238895345"/>
+      <w:bookmarkStart w:id="78" w:name="_Toc239466281"/>
       <w:r>
         <w:t xml:space="preserve">Bảng </w:t>
       </w:r>
@@ -15235,7 +15281,7 @@
       <w:pPr>
         <w:pStyle w:val="Caption"/>
       </w:pPr>
-      <w:bookmarkStart w:id="80" w:name="_Toc238895346"/>
+      <w:bookmarkStart w:id="80" w:name="_Toc239466282"/>
       <w:r>
         <w:t xml:space="preserve">Bảng </w:t>
       </w:r>
@@ -16071,7 +16117,7 @@
       <w:pPr>
         <w:pStyle w:val="Caption"/>
       </w:pPr>
-      <w:bookmarkStart w:id="82" w:name="_Toc238895347"/>
+      <w:bookmarkStart w:id="82" w:name="_Toc239466283"/>
       <w:r>
         <w:t xml:space="preserve">Bảng </w:t>
       </w:r>
@@ -16753,7 +16799,7 @@
       <w:pPr>
         <w:pStyle w:val="Caption"/>
       </w:pPr>
-      <w:bookmarkStart w:id="84" w:name="_Toc238895348"/>
+      <w:bookmarkStart w:id="84" w:name="_Toc239466284"/>
       <w:r>
         <w:t xml:space="preserve">Bảng </w:t>
       </w:r>
@@ -17125,6 +17171,85 @@
         <w:t>Trực quan hóa dữ liệu</w:t>
       </w:r>
       <w:bookmarkEnd w:id="87"/>
+    </w:p>
+    <w:p>
+      <w:r>
+        <w:t>Sau khi hoàn thành quá trình xử lý và phân tích dữ liệu, kết quả được đưa vào Power BI để xây dựng Dashboard trực quan hóa tình hình học sinh. Dashboard tổng quan cung cấp cái nhìn khái quát về quy mô học sinh theo khối, xu hướng biến động qua các năm học và cơ cấu giới tính.</w:t>
+      </w:r>
+    </w:p>
+    <w:p>
+      <w:r>
+        <w:rPr>
+          <w:noProof/>
+        </w:rPr>
+        <w:lastRenderedPageBreak/>
+        <w:drawing>
+          <wp:inline distT="0" distB="0" distL="0" distR="0" wp14:anchorId="42927818" wp14:editId="081606E4">
+            <wp:extent cx="5761990" cy="3223260"/>
+            <wp:effectExtent l="0" t="0" r="0" b="0"/>
+            <wp:docPr id="320601424" name="Picture 1"/>
+            <wp:cNvGraphicFramePr>
+              <a:graphicFrameLocks xmlns:a="http://schemas.openxmlformats.org/drawingml/2006/main" noChangeAspect="1"/>
+            </wp:cNvGraphicFramePr>
+            <a:graphic xmlns:a="http://schemas.openxmlformats.org/drawingml/2006/main">
+              <a:graphicData uri="http://schemas.openxmlformats.org/drawingml/2006/picture">
+                <pic:pic xmlns:pic="http://schemas.openxmlformats.org/drawingml/2006/picture">
+                  <pic:nvPicPr>
+                    <pic:cNvPr id="320601424" name=""/>
+                    <pic:cNvPicPr/>
+                  </pic:nvPicPr>
+                  <pic:blipFill>
+                    <a:blip r:embed="rId13"/>
+                    <a:stretch>
+                      <a:fillRect/>
+                    </a:stretch>
+                  </pic:blipFill>
+                  <pic:spPr>
+                    <a:xfrm>
+                      <a:off x="0" y="0"/>
+                      <a:ext cx="5761990" cy="3223260"/>
+                    </a:xfrm>
+                    <a:prstGeom prst="rect">
+                      <a:avLst/>
+                    </a:prstGeom>
+                  </pic:spPr>
+                </pic:pic>
+              </a:graphicData>
+            </a:graphic>
+          </wp:inline>
+        </w:drawing>
+      </w:r>
+    </w:p>
+    <w:p>
+      <w:pPr>
+        <w:pStyle w:val="Caption"/>
+      </w:pPr>
+      <w:bookmarkStart w:id="88" w:name="_Toc239466274"/>
+      <w:r>
+        <w:t xml:space="preserve">Hình </w:t>
+      </w:r>
+      <w:fldSimple w:instr=" SEQ Hình \* ARABIC ">
+        <w:r>
+          <w:rPr>
+            <w:noProof/>
+          </w:rPr>
+          <w:t>6</w:t>
+        </w:r>
+      </w:fldSimple>
+      <w:r>
+        <w:t>: Dashboard tổng quan phân tích dữ liệu học sinh trên Power BI</w:t>
+      </w:r>
+      <w:bookmarkEnd w:id="88"/>
+    </w:p>
+    <w:p>
+      <w:r>
+        <w:t>Qua Dashboard tổng quan, có thể nhận thấy quy mô học sinh của nhà trường có xu hướng giảm liên tục qua các năm học, từ 601 học sinh năm học 2022–2023 xuống còn 508 học sinh năm học 2026–2027. Quy mô học sinh giữa các khối có sự chênh lệch nhưng không quá lớn. Về cơ cấu giới tính, học sinh nữ chiếm 51,65%, cao hơn học sinh nam 48,35%, cho thấy cơ cấu giới tính tương đối cân bằng. Các kết quả trên giúp cung cấp cái nhìn tổng quát về quy mô và cơ cấu học sinh, làm cơ sở cho các phân tích chi tiết ở các nội dung tiếp theo.</w:t>
+      </w:r>
+    </w:p>
+    <w:p>
+      <w:r>
+        <w:t xml:space="preserve"> </w:t>
+      </w:r>
       <w:r>
         <w:br w:type="page"/>
       </w:r>
@@ -17134,12 +17259,12 @@
         <w:pStyle w:val="Heading1"/>
         <w:spacing w:before="0" w:after="0"/>
       </w:pPr>
-      <w:bookmarkStart w:id="88" w:name="_Toc238895411"/>
+      <w:bookmarkStart w:id="89" w:name="_Toc238895411"/>
       <w:r>
         <w:lastRenderedPageBreak/>
         <w:t>Chương 5: Kết quả đạt được qua đợt thực tập</w:t>
       </w:r>
-      <w:bookmarkEnd w:id="88"/>
+      <w:bookmarkEnd w:id="89"/>
     </w:p>
     <w:p>
       <w:r>
@@ -17169,14 +17294,14 @@
           <w:lang w:val="en-US"/>
         </w:rPr>
       </w:pPr>
-      <w:bookmarkStart w:id="89" w:name="Tailieu1"/>
+      <w:bookmarkStart w:id="90" w:name="Tailieu1"/>
       <w:r>
         <w:rPr>
           <w:lang w:val="en-US"/>
         </w:rPr>
         <w:t xml:space="preserve">[1] </w:t>
       </w:r>
-      <w:bookmarkEnd w:id="89"/>
+      <w:bookmarkEnd w:id="90"/>
       <w:r>
         <w:t>Zins, C. (2007). Conceptual approaches for defining data, information, and knowledge. </w:t>
       </w:r>
@@ -17207,14 +17332,14 @@
           <w:lang w:val="en-US"/>
         </w:rPr>
       </w:pPr>
-      <w:bookmarkStart w:id="90" w:name="Tailieu2"/>
+      <w:bookmarkStart w:id="91" w:name="Tailieu2"/>
       <w:r>
         <w:rPr>
           <w:lang w:val="en-US"/>
         </w:rPr>
         <w:t xml:space="preserve">[2] </w:t>
       </w:r>
-      <w:bookmarkEnd w:id="90"/>
+      <w:bookmarkEnd w:id="91"/>
       <w:r>
         <w:t>Tukey, J. W. (1977). </w:t>
       </w:r>
@@ -17235,7 +17360,7 @@
           <w:lang w:val="en-US"/>
         </w:rPr>
       </w:pPr>
-      <w:bookmarkStart w:id="91" w:name="Tailieu3"/>
+      <w:bookmarkStart w:id="92" w:name="Tailieu3"/>
       <w:r>
         <w:rPr>
           <w:lang w:val="en-US"/>
@@ -17254,7 +17379,7 @@
         </w:rPr>
         <w:t xml:space="preserve">] </w:t>
       </w:r>
-      <w:bookmarkEnd w:id="91"/>
+      <w:bookmarkEnd w:id="92"/>
       <w:r>
         <w:t>McKinney, W., Steele, J., Blanchette, M., &amp; Demarest, R. (2013, October). </w:t>
       </w:r>
@@ -17275,14 +17400,14 @@
           <w:lang w:val="en-US"/>
         </w:rPr>
       </w:pPr>
-      <w:bookmarkStart w:id="92" w:name="Tailieu4"/>
+      <w:bookmarkStart w:id="93" w:name="Tailieu4"/>
       <w:r>
         <w:rPr>
           <w:lang w:val="en-US"/>
         </w:rPr>
         <w:t xml:space="preserve">[4] </w:t>
       </w:r>
-      <w:bookmarkEnd w:id="92"/>
+      <w:bookmarkEnd w:id="93"/>
       <w:r>
         <w:t>Collier, C. A., &amp; Powell, A. L. (2024). Data analyst competencies: A theory-driven investigation of industry requirements in the field of data analytics. </w:t>
       </w:r>
@@ -17313,7 +17438,7 @@
           <w:lang w:val="en-US"/>
         </w:rPr>
       </w:pPr>
-      <w:bookmarkStart w:id="93" w:name="Tailieu5"/>
+      <w:bookmarkStart w:id="94" w:name="Tailieu5"/>
       <w:r>
         <w:rPr>
           <w:lang w:val="en-US"/>
@@ -17340,15 +17465,15 @@
           <w:lang w:val="en-US"/>
         </w:rPr>
       </w:pPr>
-      <w:bookmarkStart w:id="94" w:name="Tailieu6"/>
-      <w:bookmarkEnd w:id="93"/>
+      <w:bookmarkStart w:id="95" w:name="Tailieu6"/>
+      <w:bookmarkEnd w:id="94"/>
       <w:r>
         <w:rPr>
           <w:lang w:val="en-US"/>
         </w:rPr>
         <w:t xml:space="preserve">[6] </w:t>
       </w:r>
-      <w:bookmarkEnd w:id="94"/>
+      <w:bookmarkEnd w:id="95"/>
       <w:r>
         <w:t>Awang, Z. (2012). </w:t>
       </w:r>
@@ -17369,14 +17494,14 @@
           <w:lang w:val="en-US"/>
         </w:rPr>
       </w:pPr>
-      <w:bookmarkStart w:id="95" w:name="Tailieu7"/>
+      <w:bookmarkStart w:id="96" w:name="Tailieu7"/>
       <w:r>
         <w:rPr>
           <w:lang w:val="en-US"/>
         </w:rPr>
         <w:t xml:space="preserve">[7] </w:t>
       </w:r>
-      <w:bookmarkEnd w:id="95"/>
+      <w:bookmarkEnd w:id="96"/>
       <w:r>
         <w:t>Johnson, T., &amp; Dasu, T. (2003, June). Data quality and data cleaning: An overview. In </w:t>
       </w:r>
@@ -17397,14 +17522,14 @@
           <w:lang w:val="en-US"/>
         </w:rPr>
       </w:pPr>
-      <w:bookmarkStart w:id="96" w:name="Tailieu8"/>
+      <w:bookmarkStart w:id="97" w:name="Tailieu8"/>
       <w:r>
         <w:rPr>
           <w:lang w:val="en-US"/>
         </w:rPr>
         <w:t xml:space="preserve">[8] </w:t>
       </w:r>
-      <w:bookmarkEnd w:id="96"/>
+      <w:bookmarkEnd w:id="97"/>
       <w:r>
         <w:t>Unwin, A. (2020). Why is data visualization important? what is important in data visualization?. </w:t>
       </w:r>
@@ -17435,14 +17560,14 @@
           <w:lang w:val="en-US"/>
         </w:rPr>
       </w:pPr>
-      <w:bookmarkStart w:id="97" w:name="Tailieu9"/>
+      <w:bookmarkStart w:id="98" w:name="Tailieu9"/>
       <w:r>
         <w:rPr>
           <w:lang w:val="en-US"/>
         </w:rPr>
         <w:t>[9]</w:t>
       </w:r>
-      <w:bookmarkEnd w:id="97"/>
+      <w:bookmarkEnd w:id="98"/>
       <w:r>
         <w:rPr>
           <w:lang w:val="en-US"/>
@@ -17469,14 +17594,14 @@
           <w:lang w:val="en-US"/>
         </w:rPr>
       </w:pPr>
-      <w:bookmarkStart w:id="98" w:name="Tailieu10"/>
+      <w:bookmarkStart w:id="99" w:name="Tailieu10"/>
       <w:r>
         <w:rPr>
           <w:lang w:val="en-US"/>
         </w:rPr>
         <w:t xml:space="preserve">[10] </w:t>
       </w:r>
-      <w:bookmarkEnd w:id="98"/>
+      <w:bookmarkEnd w:id="99"/>
       <w:r>
         <w:t>Devore, J. (2007). Making sense of data: A practical guide to exploratory data analysis and data mining.</w:t>
       </w:r>
@@ -17487,14 +17612,14 @@
           <w:lang w:val="en-US"/>
         </w:rPr>
       </w:pPr>
-      <w:bookmarkStart w:id="99" w:name="Tailieu11"/>
+      <w:bookmarkStart w:id="100" w:name="Tailieu11"/>
       <w:r>
         <w:rPr>
           <w:lang w:val="en-US"/>
         </w:rPr>
         <w:t xml:space="preserve">[11] </w:t>
       </w:r>
-      <w:bookmarkEnd w:id="99"/>
+      <w:bookmarkEnd w:id="100"/>
       <w:r>
         <w:t>Larose, D. T., &amp; Larose, C. D. (2014). </w:t>
       </w:r>
@@ -17515,14 +17640,14 @@
           <w:lang w:val="en-US"/>
         </w:rPr>
       </w:pPr>
-      <w:bookmarkStart w:id="100" w:name="Tailieu12"/>
+      <w:bookmarkStart w:id="101" w:name="Tailieu12"/>
       <w:r>
         <w:rPr>
           <w:lang w:val="en-US"/>
         </w:rPr>
         <w:t xml:space="preserve">[12] </w:t>
       </w:r>
-      <w:bookmarkEnd w:id="100"/>
+      <w:bookmarkEnd w:id="101"/>
       <w:r>
         <w:t>García, S., Luengo, J., &amp; Herrera, F. (2015). </w:t>
       </w:r>
@@ -17543,7 +17668,7 @@
           <w:lang w:val="en-US"/>
         </w:rPr>
       </w:pPr>
-      <w:bookmarkStart w:id="101" w:name="Tailieu13"/>
+      <w:bookmarkStart w:id="102" w:name="Tailieu13"/>
       <w:r>
         <w:rPr>
           <w:lang w:val="en-US"/>
@@ -17551,7 +17676,7 @@
         <w:lastRenderedPageBreak/>
         <w:t xml:space="preserve">[13] </w:t>
       </w:r>
-      <w:bookmarkEnd w:id="101"/>
+      <w:bookmarkEnd w:id="102"/>
       <w:r>
         <w:t>Kirk, A. (2012). </w:t>
       </w:r>
@@ -17572,14 +17697,14 @@
           <w:lang w:val="en-US"/>
         </w:rPr>
       </w:pPr>
-      <w:bookmarkStart w:id="102" w:name="Tailieu14"/>
+      <w:bookmarkStart w:id="103" w:name="Tailieu14"/>
       <w:r>
         <w:rPr>
           <w:lang w:val="en-US"/>
         </w:rPr>
         <w:t xml:space="preserve">[14] </w:t>
       </w:r>
-      <w:bookmarkEnd w:id="102"/>
+      <w:bookmarkEnd w:id="103"/>
       <w:r>
         <w:t>Wolniak, R. (2023). The concept of descriptive analytics. </w:t>
       </w:r>
@@ -17600,14 +17725,14 @@
           <w:lang w:val="en-US"/>
         </w:rPr>
       </w:pPr>
-      <w:bookmarkStart w:id="103" w:name="Tailieu15"/>
+      <w:bookmarkStart w:id="104" w:name="Tailieu15"/>
       <w:r>
         <w:rPr>
           <w:lang w:val="en-US"/>
         </w:rPr>
         <w:t xml:space="preserve">[15] </w:t>
       </w:r>
-      <w:bookmarkEnd w:id="103"/>
+      <w:bookmarkEnd w:id="104"/>
       <w:r>
         <w:t>Wolniak, R., &amp; Grebski, W. (2023). The concept of diagnostic analytics. </w:t>
       </w:r>
@@ -17628,14 +17753,14 @@
           <w:lang w:val="en-US"/>
         </w:rPr>
       </w:pPr>
-      <w:bookmarkStart w:id="104" w:name="Tailieu16"/>
+      <w:bookmarkStart w:id="105" w:name="Tailieu16"/>
       <w:r>
         <w:rPr>
           <w:lang w:val="en-US"/>
         </w:rPr>
         <w:t xml:space="preserve">[16] </w:t>
       </w:r>
-      <w:bookmarkEnd w:id="104"/>
+      <w:bookmarkEnd w:id="105"/>
       <w:r>
         <w:t>Kotu, V., Deshpande, B., &amp; Deshpande, B. (2014). </w:t>
       </w:r>
@@ -17656,14 +17781,14 @@
           <w:lang w:val="en-US"/>
         </w:rPr>
       </w:pPr>
-      <w:bookmarkStart w:id="105" w:name="Tailieu17"/>
+      <w:bookmarkStart w:id="106" w:name="Tailieu17"/>
       <w:r>
         <w:rPr>
           <w:lang w:val="en-US"/>
         </w:rPr>
         <w:t xml:space="preserve">[17] </w:t>
       </w:r>
-      <w:bookmarkEnd w:id="105"/>
+      <w:bookmarkEnd w:id="106"/>
       <w:r>
         <w:t>Lepenioti, K., Bousdekis, A., Apostolou, D., &amp; Mentzas, G. (2020). Prescriptive analytics: Literature review and research challenges. </w:t>
       </w:r>
@@ -17797,7 +17922,7 @@
                     </wp:anchor>
                   </w:drawing>
                 </mc:Choice>
-                <mc:Fallback xmlns:sl="http://schemas.openxmlformats.org/schemaLibrary/2006/main" xmlns:a="http://schemas.openxmlformats.org/drawingml/2006/main" xmlns:pic="http://schemas.openxmlformats.org/drawingml/2006/picture" xmlns:c="http://schemas.openxmlformats.org/drawingml/2006/chart" xmlns:lc="http://schemas.openxmlformats.org/drawingml/2006/lockedCanvas" xmlns:dgm="http://schemas.openxmlformats.org/drawingml/2006/diagram" xmlns="http://schemas.microsoft.com/office/tasks/2019/documenttasks" xmlns:cr="http://schemas.microsoft.com/office/comments/2020/reactions">
+                <mc:Fallback xmlns:cr="http://schemas.microsoft.com/office/comments/2020/reactions" xmlns="http://schemas.microsoft.com/office/tasks/2019/documenttasks" xmlns:dgm="http://schemas.openxmlformats.org/drawingml/2006/diagram" xmlns:lc="http://schemas.openxmlformats.org/drawingml/2006/lockedCanvas" xmlns:c="http://schemas.openxmlformats.org/drawingml/2006/chart" xmlns:pic="http://schemas.openxmlformats.org/drawingml/2006/picture" xmlns:a="http://schemas.openxmlformats.org/drawingml/2006/main" xmlns:sl="http://schemas.openxmlformats.org/schemaLibrary/2006/main">
                   <w:drawing>
                     <wp:anchor allowOverlap="1" behindDoc="0" distB="4294967295" distT="4294967295" distL="114300" distR="114300" hidden="0" layoutInCell="1" locked="0" relativeHeight="0" simplePos="0">
                       <wp:simplePos x="0" y="0"/>
@@ -17819,7 +17944,7 @@
                               <pic:cNvPicPr preferRelativeResize="0"/>
                             </pic:nvPicPr>
                             <pic:blipFill>
-                              <a:blip r:embed="rId13"/>
+                              <a:blip r:embed="rId14"/>
                               <a:srcRect/>
                               <a:stretch>
                                 <a:fillRect/>
@@ -17941,7 +18066,7 @@
                     </wp:anchor>
                   </w:drawing>
                 </mc:Choice>
-                <mc:Fallback xmlns:sl="http://schemas.openxmlformats.org/schemaLibrary/2006/main" xmlns:a="http://schemas.openxmlformats.org/drawingml/2006/main" xmlns:pic="http://schemas.openxmlformats.org/drawingml/2006/picture" xmlns:c="http://schemas.openxmlformats.org/drawingml/2006/chart" xmlns:lc="http://schemas.openxmlformats.org/drawingml/2006/lockedCanvas" xmlns:dgm="http://schemas.openxmlformats.org/drawingml/2006/diagram" xmlns="http://schemas.microsoft.com/office/tasks/2019/documenttasks" xmlns:cr="http://schemas.microsoft.com/office/comments/2020/reactions">
+                <mc:Fallback xmlns:cr="http://schemas.microsoft.com/office/comments/2020/reactions" xmlns="http://schemas.microsoft.com/office/tasks/2019/documenttasks" xmlns:dgm="http://schemas.openxmlformats.org/drawingml/2006/diagram" xmlns:lc="http://schemas.openxmlformats.org/drawingml/2006/lockedCanvas" xmlns:c="http://schemas.openxmlformats.org/drawingml/2006/chart" xmlns:pic="http://schemas.openxmlformats.org/drawingml/2006/picture" xmlns:a="http://schemas.openxmlformats.org/drawingml/2006/main" xmlns:sl="http://schemas.openxmlformats.org/schemaLibrary/2006/main">
                   <w:drawing>
                     <wp:anchor allowOverlap="1" behindDoc="0" distB="4294967295" distT="4294967295" distL="114300" distR="114300" hidden="0" layoutInCell="1" locked="0" relativeHeight="0" simplePos="0">
                       <wp:simplePos x="0" y="0"/>
@@ -17963,7 +18088,7 @@
                               <pic:cNvPicPr preferRelativeResize="0"/>
                             </pic:nvPicPr>
                             <pic:blipFill>
-                              <a:blip r:embed="rId13"/>
+                              <a:blip r:embed="rId14"/>
                               <a:srcRect/>
                               <a:stretch>
                                 <a:fillRect/>
@@ -18012,8 +18137,8 @@
                 <w:iCs/>
               </w:rPr>
             </w:pPr>
-            <w:bookmarkStart w:id="106" w:name="_vdnot9duur4z" w:colFirst="0" w:colLast="0"/>
-            <w:bookmarkEnd w:id="106"/>
+            <w:bookmarkStart w:id="107" w:name="_vdnot9duur4z" w:colFirst="0" w:colLast="0"/>
+            <w:bookmarkEnd w:id="107"/>
             <w:r>
               <w:rPr>
                 <w:i/>
@@ -19103,7 +19228,7 @@
                     </wp:anchor>
                   </w:drawing>
                 </mc:Choice>
-                <mc:Fallback xmlns:sl="http://schemas.openxmlformats.org/schemaLibrary/2006/main" xmlns:a="http://schemas.openxmlformats.org/drawingml/2006/main" xmlns:pic="http://schemas.openxmlformats.org/drawingml/2006/picture" xmlns:c="http://schemas.openxmlformats.org/drawingml/2006/chart" xmlns:lc="http://schemas.openxmlformats.org/drawingml/2006/lockedCanvas" xmlns:dgm="http://schemas.openxmlformats.org/drawingml/2006/diagram" xmlns="http://schemas.microsoft.com/office/tasks/2019/documenttasks" xmlns:cr="http://schemas.microsoft.com/office/comments/2020/reactions">
+                <mc:Fallback xmlns:cr="http://schemas.microsoft.com/office/comments/2020/reactions" xmlns="http://schemas.microsoft.com/office/tasks/2019/documenttasks" xmlns:dgm="http://schemas.openxmlformats.org/drawingml/2006/diagram" xmlns:lc="http://schemas.openxmlformats.org/drawingml/2006/lockedCanvas" xmlns:c="http://schemas.openxmlformats.org/drawingml/2006/chart" xmlns:pic="http://schemas.openxmlformats.org/drawingml/2006/picture" xmlns:a="http://schemas.openxmlformats.org/drawingml/2006/main" xmlns:sl="http://schemas.openxmlformats.org/schemaLibrary/2006/main">
                   <w:drawing>
                     <wp:anchor allowOverlap="1" behindDoc="0" distB="4294967295" distT="4294967295" distL="114300" distR="114300" hidden="0" layoutInCell="1" locked="0" relativeHeight="0" simplePos="0">
                       <wp:simplePos x="0" y="0"/>
@@ -19125,7 +19250,7 @@
                               <pic:cNvPicPr preferRelativeResize="0"/>
                             </pic:nvPicPr>
                             <pic:blipFill>
-                              <a:blip r:embed="rId13"/>
+                              <a:blip r:embed="rId14"/>
                               <a:srcRect/>
                               <a:stretch>
                                 <a:fillRect/>
@@ -19247,7 +19372,7 @@
                     </wp:anchor>
                   </w:drawing>
                 </mc:Choice>
-                <mc:Fallback xmlns:sl="http://schemas.openxmlformats.org/schemaLibrary/2006/main" xmlns:a="http://schemas.openxmlformats.org/drawingml/2006/main" xmlns:pic="http://schemas.openxmlformats.org/drawingml/2006/picture" xmlns:c="http://schemas.openxmlformats.org/drawingml/2006/chart" xmlns:lc="http://schemas.openxmlformats.org/drawingml/2006/lockedCanvas" xmlns:dgm="http://schemas.openxmlformats.org/drawingml/2006/diagram" xmlns="http://schemas.microsoft.com/office/tasks/2019/documenttasks" xmlns:cr="http://schemas.microsoft.com/office/comments/2020/reactions">
+                <mc:Fallback xmlns:cr="http://schemas.microsoft.com/office/comments/2020/reactions" xmlns="http://schemas.microsoft.com/office/tasks/2019/documenttasks" xmlns:dgm="http://schemas.openxmlformats.org/drawingml/2006/diagram" xmlns:lc="http://schemas.openxmlformats.org/drawingml/2006/lockedCanvas" xmlns:c="http://schemas.openxmlformats.org/drawingml/2006/chart" xmlns:pic="http://schemas.openxmlformats.org/drawingml/2006/picture" xmlns:a="http://schemas.openxmlformats.org/drawingml/2006/main" xmlns:sl="http://schemas.openxmlformats.org/schemaLibrary/2006/main">
                   <w:drawing>
                     <wp:anchor allowOverlap="1" behindDoc="0" distB="4294967295" distT="4294967295" distL="114300" distR="114300" hidden="0" layoutInCell="1" locked="0" relativeHeight="0" simplePos="0">
                       <wp:simplePos x="0" y="0"/>
@@ -19269,7 +19394,7 @@
                               <pic:cNvPicPr preferRelativeResize="0"/>
                             </pic:nvPicPr>
                             <pic:blipFill>
-                              <a:blip r:embed="rId13"/>
+                              <a:blip r:embed="rId14"/>
                               <a:srcRect/>
                               <a:stretch>
                                 <a:fillRect/>
@@ -20549,8 +20674,47 @@
           </w:tcPr>
           <w:p>
             <w:pPr>
+              <w:spacing w:line="432" w:lineRule="auto"/>
               <w:jc w:val="both"/>
             </w:pPr>
+            <w:r>
+              <w:t>- Tiếp tục tổng hợp và rà soát số liệu học sinh đã được cập nhật.</w:t>
+            </w:r>
+          </w:p>
+          <w:p>
+            <w:pPr>
+              <w:spacing w:line="432" w:lineRule="auto"/>
+              <w:jc w:val="both"/>
+            </w:pPr>
+            <w:r>
+              <w:t>- Phân loại dữ liệu theo một số tiêu chí như năm học, khối lớp và giới tính.</w:t>
+            </w:r>
+          </w:p>
+          <w:p>
+            <w:pPr>
+              <w:spacing w:line="432" w:lineRule="auto"/>
+              <w:jc w:val="both"/>
+            </w:pPr>
+            <w:r>
+              <w:t>- Thực hiện thống kê số lượng học sinh phục vụ cho việc tổng hợp và phân tích dữ liệu.</w:t>
+            </w:r>
+          </w:p>
+          <w:p>
+            <w:pPr>
+              <w:spacing w:line="432" w:lineRule="auto"/>
+              <w:jc w:val="both"/>
+            </w:pPr>
+            <w:r>
+              <w:t>- Kiểm tra kết quả thống kê, đối chiếu với dữ liệu ban đầu nhằm đảm bảo tính chính xác.</w:t>
+            </w:r>
+          </w:p>
+          <w:p>
+            <w:pPr>
+              <w:jc w:val="both"/>
+            </w:pPr>
+            <w:r>
+              <w:t>- Tiếp tục thực hiện các nội dung phân tích phục vụ đề tài thực tập.</w:t>
+            </w:r>
           </w:p>
         </w:tc>
         <w:tc>
@@ -20572,8 +20736,47 @@
           </w:tcPr>
           <w:p>
             <w:pPr>
+              <w:spacing w:line="432" w:lineRule="auto"/>
               <w:jc w:val="both"/>
             </w:pPr>
+            <w:r>
+              <w:rPr>
+                <w:lang w:val="vi-VN"/>
+              </w:rPr>
+              <w:t xml:space="preserve">- </w:t>
+            </w:r>
+            <w:r>
+              <w:t>Hoàn thành việc tổng hợp và phân loại dữ liệu học sinh theo các tiêu chí được lựa chọn.</w:t>
+            </w:r>
+          </w:p>
+          <w:p>
+            <w:pPr>
+              <w:spacing w:line="432" w:lineRule="auto"/>
+              <w:jc w:val="both"/>
+            </w:pPr>
+            <w:r>
+              <w:t xml:space="preserve">- </w:t>
+            </w:r>
+            <w:r>
+              <w:t>Thực hiện thống kê số lượng học sinh theo các tiêu chí được lựa chọn để phục vụ việc phân tích dữ liệu.</w:t>
+            </w:r>
+          </w:p>
+          <w:p>
+            <w:pPr>
+              <w:spacing w:line="432" w:lineRule="auto"/>
+              <w:jc w:val="both"/>
+            </w:pPr>
+            <w:r>
+              <w:t>- Hoàn thành bước xử lý dữ liệu phục vụ cho việc phân tích trong báo cáo thực tập.</w:t>
+            </w:r>
+          </w:p>
+          <w:p>
+            <w:pPr>
+              <w:jc w:val="both"/>
+            </w:pPr>
+            <w:r>
+              <w:t>- Kết quả thống kê được kiểm tra và đối chiếu với dữ liệu ban đầu.</w:t>
+            </w:r>
           </w:p>
         </w:tc>
         <w:tc>
@@ -20585,6 +20788,9 @@
             <w:pPr>
               <w:jc w:val="center"/>
             </w:pPr>
+            <w:r>
+              <w:t>- Có thời gian nghỉ lễ theo quy định.</w:t>
+            </w:r>
           </w:p>
         </w:tc>
       </w:tr>
@@ -20698,6 +20904,7 @@
                 <w:b/>
                 <w:bCs/>
               </w:rPr>
+              <w:lastRenderedPageBreak/>
               <w:t>Tuần 10</w:t>
             </w:r>
           </w:p>
@@ -20909,7 +21116,7 @@
     <w:p/>
     <w:p/>
     <w:sectPr>
-      <w:footerReference w:type="default" r:id="rId14"/>
+      <w:footerReference w:type="default" r:id="rId15"/>
       <w:pgSz w:w="11909" w:h="16834"/>
       <w:pgMar w:top="1134" w:right="1134" w:bottom="1134" w:left="1701" w:header="720" w:footer="720" w:gutter="0"/>
       <w:pgNumType w:start="1"/>
@@ -28471,7 +28678,6 @@
   <w:style w:type="character" w:default="1" w:styleId="DefaultParagraphFont">
     <w:name w:val="Default Paragraph Font"/>
     <w:uiPriority w:val="1"/>
-    <w:semiHidden/>
     <w:unhideWhenUsed/>
   </w:style>
   <w:style w:type="table" w:default="1" w:styleId="TableNormal">

</xml_diff>